<commit_message>
última versión del paper 1 (2026), culminación del borrador
</commit_message>
<xml_diff>
--- a/TESIS 2/PRISMA/PRISMA_2020.docx
+++ b/TESIS 2/PRISMA/PRISMA_2020.docx
@@ -948,17 +948,7 @@
                                 <w:sz w:val="18"/>
                                 <w:szCs w:val="20"/>
                               </w:rPr>
-                              <w:t xml:space="preserve"> </w:t>
-                            </w:r>
-                            <w:proofErr w:type="gramStart"/>
-                            <w:r>
-                              <w:rPr>
-                                <w:rFonts w:ascii="Arial" w:hAnsi="Arial" w:cs="Arial"/>
-                                <w:color w:val="000000" w:themeColor="text1"/>
-                                <w:sz w:val="18"/>
-                                <w:szCs w:val="20"/>
-                              </w:rPr>
-                              <w:t xml:space="preserve">removed </w:t>
+                              <w:t xml:space="preserve"> removed</w:t>
                             </w:r>
                             <w:r>
                               <w:rPr>
@@ -969,7 +959,6 @@
                               </w:rPr>
                               <w:t xml:space="preserve"> (</w:t>
                             </w:r>
-                            <w:proofErr w:type="gramEnd"/>
                             <w:r>
                               <w:rPr>
                                 <w:rFonts w:ascii="Arial" w:hAnsi="Arial" w:cs="Arial"/>
@@ -1240,17 +1229,7 @@
                           <w:sz w:val="18"/>
                           <w:szCs w:val="20"/>
                         </w:rPr>
-                        <w:t xml:space="preserve"> </w:t>
-                      </w:r>
-                      <w:proofErr w:type="gramStart"/>
-                      <w:r>
-                        <w:rPr>
-                          <w:rFonts w:ascii="Arial" w:hAnsi="Arial" w:cs="Arial"/>
-                          <w:color w:val="000000" w:themeColor="text1"/>
-                          <w:sz w:val="18"/>
-                          <w:szCs w:val="20"/>
-                        </w:rPr>
-                        <w:t xml:space="preserve">removed </w:t>
+                        <w:t xml:space="preserve"> removed</w:t>
                       </w:r>
                       <w:r>
                         <w:rPr>
@@ -1261,7 +1240,6 @@
                         </w:rPr>
                         <w:t xml:space="preserve"> (</w:t>
                       </w:r>
-                      <w:proofErr w:type="gramEnd"/>
                       <w:r>
                         <w:rPr>
                           <w:rFonts w:ascii="Arial" w:hAnsi="Arial" w:cs="Arial"/>
@@ -6179,7 +6157,7 @@
           <w:szCs w:val="20"/>
         </w:rPr>
       </w:pPr>
-      <w:bookmarkStart w:id="2" w:name="_Hlk67299547"/>
+      <w:bookmarkStart w:id="1" w:name="_Hlk67299547"/>
     </w:p>
     <w:p>
       <w:pPr>
@@ -6455,7 +6433,7 @@
         <w:t xml:space="preserve"> </w:t>
       </w:r>
     </w:p>
-    <w:bookmarkEnd w:id="2"/>
+    <w:bookmarkEnd w:id="1"/>
     <w:p>
       <w:pPr>
         <w:pStyle w:val="Textocomentario"/>

</xml_diff>